<commit_message>
Aqui estoy y el nos ama
</commit_message>
<xml_diff>
--- a/Work/Tu amor no tiene fín.docx
+++ b/Work/Tu amor no tiene fín.docx
@@ -613,7 +613,7 @@
                                 <w:sz w:val="28"/>
                                 <w:szCs w:val="28"/>
                               </w:rPr>
-                              <w:t>restáurame, enamórame.</w:t>
+                              <w:t>restáurame, enamórame</w:t>
                             </w:r>
                           </w:p>
                           <w:p>
@@ -1174,7 +1174,7 @@
                           <w:sz w:val="28"/>
                           <w:szCs w:val="28"/>
                         </w:rPr>
-                        <w:t>restáurame, enamórame.</w:t>
+                        <w:t>restáurame, enamórame</w:t>
                       </w:r>
                     </w:p>
                     <w:p>
@@ -1661,7 +1661,7 @@
           <w:sz w:val="28"/>
           <w:szCs w:val="28"/>
         </w:rPr>
-        <w:t>no tiene fin.</w:t>
+        <w:t>no tiene fin</w:t>
       </w:r>
     </w:p>
     <w:p>

</xml_diff>